<commit_message>
insert stock, stock transfer
</commit_message>
<xml_diff>
--- a/docs/dreams_pos.docx
+++ b/docs/dreams_pos.docx
@@ -6,7 +6,6 @@
       <w:pPr>
         <w:jc w:val="center"/>
       </w:pPr>
-      <w:proofErr w:type="spellStart"/>
       <w:r>
         <w:rPr>
           <w:b/>
@@ -14,9 +13,8 @@
           <w:sz w:val="60"/>
           <w:szCs w:val="60"/>
         </w:rPr>
-        <w:t>KroyGhor</w:t>
+        <w:t>Dreams</w:t>
       </w:r>
-      <w:proofErr w:type="spellEnd"/>
       <w:r>
         <w:rPr>
           <w:b/>
@@ -47,7 +45,23 @@
           <w:b/>
           <w:sz w:val="60"/>
         </w:rPr>
-        <w:t xml:space="preserve"> Management System</w:t>
+        <w:t xml:space="preserve"> </w:t>
+      </w:r>
+      <w:bookmarkStart w:id="0" w:name="_GoBack"/>
+      <w:bookmarkEnd w:id="0"/>
+      <w:r>
+        <w:rPr>
+          <w:b/>
+          <w:sz w:val="60"/>
+        </w:rPr>
+        <w:t xml:space="preserve">Inventory </w:t>
+      </w:r>
+      <w:r>
+        <w:rPr>
+          <w:b/>
+          <w:sz w:val="60"/>
+        </w:rPr>
+        <w:t>Management System</w:t>
       </w:r>
     </w:p>
     <w:p>
@@ -1254,13 +1268,8 @@
         <w:pStyle w:val="Heading1"/>
       </w:pPr>
       <w:r>
-        <w:t xml:space="preserve">4. </w:t>
+        <w:t>4. Categories</w:t>
       </w:r>
-      <w:bookmarkStart w:id="0" w:name="_GoBack"/>
-      <w:r>
-        <w:t>Categories</w:t>
-      </w:r>
-      <w:bookmarkEnd w:id="0"/>
     </w:p>
     <w:tbl>
       <w:tblPr>
@@ -33376,7 +33385,7 @@
 </file>
 
 <file path=customXml/itemProps1.xml><?xml version="1.0" encoding="utf-8"?>
-<ds:datastoreItem xmlns:ds="http://schemas.openxmlformats.org/officeDocument/2006/customXml" ds:itemID="{7257C79C-4F27-4EC7-8FA5-A1E13FE60AF8}">
+<ds:datastoreItem xmlns:ds="http://schemas.openxmlformats.org/officeDocument/2006/customXml" ds:itemID="{C24AC0D7-94C9-4F66-8358-6FCBCDAABC3A}">
   <ds:schemaRefs>
     <ds:schemaRef ds:uri="http://schemas.openxmlformats.org/officeDocument/2006/bibliography"/>
   </ds:schemaRefs>

</xml_diff>